<commit_message>
feat: update 'BM04' files in 'or0017-praca-nova'
</commit_message>
<xml_diff>
--- a/obras-arquivos/or0017-praca-nova-conc042025-geo/praca-nova-geral/medicoes-edicao/BM04/RELATÓRIO FOTOGRÁFICO - BM 04 - PRAÇA NOVA COREMAS.docx
+++ b/obras-arquivos/or0017-praca-nova-conc042025-geo/praca-nova-geral/medicoes-edicao/BM04/RELATÓRIO FOTOGRÁFICO - BM 04 - PRAÇA NOVA COREMAS.docx
@@ -1033,6 +1033,56 @@
                 <w:szCs w:val="24"/>
               </w:rPr>
             </w:pPr>
+            <w:r>
+              <w:rPr>
+                <w:rFonts w:ascii="Times New Roman" w:hAnsi="Times New Roman" w:cs="Times New Roman"/>
+                <w:noProof/>
+                <w:color w:val="000000" w:themeColor="text1"/>
+                <w:sz w:val="24"/>
+                <w:szCs w:val="24"/>
+              </w:rPr>
+              <w:drawing>
+                <wp:inline distT="0" distB="0" distL="0" distR="0" wp14:anchorId="1865C912" wp14:editId="301FA06B">
+                  <wp:extent cx="2492767" cy="1871980"/>
+                  <wp:effectExtent l="0" t="0" r="3175" b="0"/>
+                  <wp:docPr id="6" name="Imagem 6"/>
+                  <wp:cNvGraphicFramePr>
+                    <a:graphicFrameLocks xmlns:a="http://schemas.openxmlformats.org/drawingml/2006/main" noChangeAspect="1"/>
+                  </wp:cNvGraphicFramePr>
+                  <a:graphic xmlns:a="http://schemas.openxmlformats.org/drawingml/2006/main">
+                    <a:graphicData uri="http://schemas.openxmlformats.org/drawingml/2006/picture">
+                      <pic:pic xmlns:pic="http://schemas.openxmlformats.org/drawingml/2006/picture">
+                        <pic:nvPicPr>
+                          <pic:cNvPr id="6" name="Imagem 6"/>
+                          <pic:cNvPicPr/>
+                        </pic:nvPicPr>
+                        <pic:blipFill>
+                          <a:blip r:embed="rId12" cstate="print">
+                            <a:extLst>
+                              <a:ext uri="{28A0092B-C50C-407E-A947-70E740481C1C}">
+                                <a14:useLocalDpi xmlns:a14="http://schemas.microsoft.com/office/drawing/2010/main" val="0"/>
+                              </a:ext>
+                            </a:extLst>
+                          </a:blip>
+                          <a:stretch>
+                            <a:fillRect/>
+                          </a:stretch>
+                        </pic:blipFill>
+                        <pic:spPr>
+                          <a:xfrm>
+                            <a:off x="0" y="0"/>
+                            <a:ext cx="2504580" cy="1880851"/>
+                          </a:xfrm>
+                          <a:prstGeom prst="rect">
+                            <a:avLst/>
+                          </a:prstGeom>
+                        </pic:spPr>
+                      </pic:pic>
+                    </a:graphicData>
+                  </a:graphic>
+                </wp:inline>
+              </w:drawing>
+            </w:r>
           </w:p>
         </w:tc>
       </w:tr>
@@ -1266,42 +1316,76 @@
               </w:tabs>
               <w:rPr>
                 <w:rFonts w:ascii="Times New Roman" w:hAnsi="Times New Roman" w:cs="Times New Roman"/>
+                <w:color w:val="000000" w:themeColor="text1"/>
+                <w:sz w:val="24"/>
+                <w:szCs w:val="24"/>
+              </w:rPr>
+            </w:pPr>
+          </w:p>
+          <w:p>
+            <w:pPr>
+              <w:tabs>
+                <w:tab w:val="left" w:pos="2450"/>
+                <w:tab w:val="center" w:pos="4252"/>
+              </w:tabs>
+              <w:jc w:val="center"/>
+              <w:rPr>
+                <w:rFonts w:ascii="Times New Roman" w:hAnsi="Times New Roman" w:cs="Times New Roman"/>
+                <w:color w:val="000000" w:themeColor="text1"/>
+                <w:sz w:val="24"/>
+                <w:szCs w:val="24"/>
+              </w:rPr>
+            </w:pPr>
+            <w:r>
+              <w:rPr>
+                <w:rFonts w:ascii="Times New Roman" w:hAnsi="Times New Roman" w:cs="Times New Roman"/>
                 <w:noProof/>
                 <w:color w:val="000000" w:themeColor="text1"/>
                 <w:sz w:val="24"/>
                 <w:szCs w:val="24"/>
               </w:rPr>
-            </w:pPr>
-          </w:p>
-          <w:p>
-            <w:pPr>
-              <w:tabs>
-                <w:tab w:val="left" w:pos="2450"/>
-                <w:tab w:val="center" w:pos="4252"/>
-              </w:tabs>
-              <w:jc w:val="center"/>
-              <w:rPr>
-                <w:rFonts w:ascii="Times New Roman" w:hAnsi="Times New Roman" w:cs="Times New Roman"/>
-                <w:color w:val="000000" w:themeColor="text1"/>
-                <w:sz w:val="24"/>
-                <w:szCs w:val="24"/>
-              </w:rPr>
-            </w:pPr>
-          </w:p>
-          <w:p>
-            <w:pPr>
-              <w:tabs>
-                <w:tab w:val="left" w:pos="2450"/>
-                <w:tab w:val="center" w:pos="4252"/>
-              </w:tabs>
-              <w:jc w:val="center"/>
-              <w:rPr>
-                <w:rFonts w:ascii="Times New Roman" w:hAnsi="Times New Roman" w:cs="Times New Roman"/>
-                <w:color w:val="000000" w:themeColor="text1"/>
-                <w:sz w:val="24"/>
-                <w:szCs w:val="24"/>
-              </w:rPr>
-            </w:pPr>
+              <w:drawing>
+                <wp:inline distT="0" distB="0" distL="0" distR="0" wp14:anchorId="3AF18A92" wp14:editId="37868DFE">
+                  <wp:extent cx="2536621" cy="1904912"/>
+                  <wp:effectExtent l="0" t="0" r="0" b="635"/>
+                  <wp:docPr id="5" name="Imagem 5"/>
+                  <wp:cNvGraphicFramePr>
+                    <a:graphicFrameLocks xmlns:a="http://schemas.openxmlformats.org/drawingml/2006/main" noChangeAspect="1"/>
+                  </wp:cNvGraphicFramePr>
+                  <a:graphic xmlns:a="http://schemas.openxmlformats.org/drawingml/2006/main">
+                    <a:graphicData uri="http://schemas.openxmlformats.org/drawingml/2006/picture">
+                      <pic:pic xmlns:pic="http://schemas.openxmlformats.org/drawingml/2006/picture">
+                        <pic:nvPicPr>
+                          <pic:cNvPr id="5" name="Imagem 5"/>
+                          <pic:cNvPicPr/>
+                        </pic:nvPicPr>
+                        <pic:blipFill>
+                          <a:blip r:embed="rId13" cstate="print">
+                            <a:extLst>
+                              <a:ext uri="{28A0092B-C50C-407E-A947-70E740481C1C}">
+                                <a14:useLocalDpi xmlns:a14="http://schemas.microsoft.com/office/drawing/2010/main" val="0"/>
+                              </a:ext>
+                            </a:extLst>
+                          </a:blip>
+                          <a:stretch>
+                            <a:fillRect/>
+                          </a:stretch>
+                        </pic:blipFill>
+                        <pic:spPr>
+                          <a:xfrm>
+                            <a:off x="0" y="0"/>
+                            <a:ext cx="2571790" cy="1931323"/>
+                          </a:xfrm>
+                          <a:prstGeom prst="rect">
+                            <a:avLst/>
+                          </a:prstGeom>
+                        </pic:spPr>
+                      </pic:pic>
+                    </a:graphicData>
+                  </a:graphic>
+                </wp:inline>
+              </w:drawing>
+            </w:r>
           </w:p>
         </w:tc>
         <w:tc>
@@ -1361,7 +1445,7 @@
                           <pic:cNvPicPr/>
                         </pic:nvPicPr>
                         <pic:blipFill>
-                          <a:blip r:embed="rId12" cstate="print">
+                          <a:blip r:embed="rId14" cstate="print">
                             <a:extLst>
                               <a:ext uri="{28A0092B-C50C-407E-A947-70E740481C1C}">
                                 <a14:useLocalDpi xmlns:a14="http://schemas.microsoft.com/office/drawing/2010/main" val="0"/>
@@ -1662,7 +1746,7 @@
                           <pic:cNvPicPr/>
                         </pic:nvPicPr>
                         <pic:blipFill>
-                          <a:blip r:embed="rId13" cstate="print">
+                          <a:blip r:embed="rId15" cstate="print">
                             <a:extLst>
                               <a:ext uri="{28A0092B-C50C-407E-A947-70E740481C1C}">
                                 <a14:useLocalDpi xmlns:a14="http://schemas.microsoft.com/office/drawing/2010/main" val="0"/>
@@ -1762,7 +1846,7 @@
                           <pic:cNvPicPr/>
                         </pic:nvPicPr>
                         <pic:blipFill>
-                          <a:blip r:embed="rId14" cstate="print">
+                          <a:blip r:embed="rId16" cstate="print">
                             <a:extLst>
                               <a:ext uri="{28A0092B-C50C-407E-A947-70E740481C1C}">
                                 <a14:useLocalDpi xmlns:a14="http://schemas.microsoft.com/office/drawing/2010/main" val="0"/>
@@ -2099,7 +2183,7 @@
                           <pic:cNvPicPr/>
                         </pic:nvPicPr>
                         <pic:blipFill>
-                          <a:blip r:embed="rId15" cstate="print">
+                          <a:blip r:embed="rId17" cstate="print">
                             <a:extLst>
                               <a:ext uri="{28A0092B-C50C-407E-A947-70E740481C1C}">
                                 <a14:useLocalDpi xmlns:a14="http://schemas.microsoft.com/office/drawing/2010/main" val="0"/>
@@ -2199,7 +2283,7 @@
                           <pic:cNvPicPr/>
                         </pic:nvPicPr>
                         <pic:blipFill>
-                          <a:blip r:embed="rId16" cstate="print">
+                          <a:blip r:embed="rId18" cstate="print">
                             <a:extLst>
                               <a:ext uri="{28A0092B-C50C-407E-A947-70E740481C1C}">
                                 <a14:useLocalDpi xmlns:a14="http://schemas.microsoft.com/office/drawing/2010/main" val="0"/>
@@ -2538,7 +2622,7 @@
                           <pic:cNvPicPr/>
                         </pic:nvPicPr>
                         <pic:blipFill>
-                          <a:blip r:embed="rId17" cstate="print">
+                          <a:blip r:embed="rId19" cstate="print">
                             <a:extLst>
                               <a:ext uri="{28A0092B-C50C-407E-A947-70E740481C1C}">
                                 <a14:useLocalDpi xmlns:a14="http://schemas.microsoft.com/office/drawing/2010/main" val="0"/>
@@ -2640,7 +2724,7 @@
                           <pic:cNvPicPr/>
                         </pic:nvPicPr>
                         <pic:blipFill>
-                          <a:blip r:embed="rId18" cstate="print">
+                          <a:blip r:embed="rId20" cstate="print">
                             <a:extLst>
                               <a:ext uri="{28A0092B-C50C-407E-A947-70E740481C1C}">
                                 <a14:useLocalDpi xmlns:a14="http://schemas.microsoft.com/office/drawing/2010/main" val="0"/>
@@ -2923,7 +3007,7 @@
                           <pic:cNvPicPr/>
                         </pic:nvPicPr>
                         <pic:blipFill>
-                          <a:blip r:embed="rId19" cstate="print">
+                          <a:blip r:embed="rId21" cstate="print">
                             <a:extLst>
                               <a:ext uri="{28A0092B-C50C-407E-A947-70E740481C1C}">
                                 <a14:useLocalDpi xmlns:a14="http://schemas.microsoft.com/office/drawing/2010/main" val="0"/>
@@ -3022,7 +3106,7 @@
                           <pic:cNvPicPr/>
                         </pic:nvPicPr>
                         <pic:blipFill>
-                          <a:blip r:embed="rId20" cstate="print">
+                          <a:blip r:embed="rId22" cstate="print">
                             <a:extLst>
                               <a:ext uri="{28A0092B-C50C-407E-A947-70E740481C1C}">
                                 <a14:useLocalDpi xmlns:a14="http://schemas.microsoft.com/office/drawing/2010/main" val="0"/>
@@ -3314,7 +3398,7 @@
                           <pic:cNvPicPr/>
                         </pic:nvPicPr>
                         <pic:blipFill>
-                          <a:blip r:embed="rId21" cstate="print">
+                          <a:blip r:embed="rId23" cstate="print">
                             <a:extLst>
                               <a:ext uri="{28A0092B-C50C-407E-A947-70E740481C1C}">
                                 <a14:useLocalDpi xmlns:a14="http://schemas.microsoft.com/office/drawing/2010/main" val="0"/>
@@ -3820,7 +3904,7 @@
                           <pic:cNvPicPr/>
                         </pic:nvPicPr>
                         <pic:blipFill>
-                          <a:blip r:embed="rId22" cstate="print">
+                          <a:blip r:embed="rId24" cstate="print">
                             <a:extLst>
                               <a:ext uri="{28A0092B-C50C-407E-A947-70E740481C1C}">
                                 <a14:useLocalDpi xmlns:a14="http://schemas.microsoft.com/office/drawing/2010/main" val="0"/>
@@ -3981,16 +4065,7 @@
                 <w:sz w:val="24"/>
                 <w:szCs w:val="24"/>
               </w:rPr>
-              <w:t xml:space="preserve">FOTO </w:t>
-            </w:r>
-            <w:r>
-              <w:rPr>
-                <w:rFonts w:ascii="Times New Roman" w:hAnsi="Times New Roman" w:cs="Times New Roman"/>
-                <w:color w:val="000000" w:themeColor="text1"/>
-                <w:sz w:val="24"/>
-                <w:szCs w:val="24"/>
-              </w:rPr>
-              <w:t>21</w:t>
+              <w:t>FOTO 21</w:t>
             </w:r>
           </w:p>
         </w:tc>
@@ -4020,16 +4095,7 @@
                 <w:sz w:val="24"/>
                 <w:szCs w:val="24"/>
               </w:rPr>
-              <w:t xml:space="preserve">FOTO </w:t>
-            </w:r>
-            <w:r>
-              <w:rPr>
-                <w:rFonts w:ascii="Times New Roman" w:hAnsi="Times New Roman" w:cs="Times New Roman"/>
-                <w:color w:val="000000" w:themeColor="text1"/>
-                <w:sz w:val="24"/>
-                <w:szCs w:val="24"/>
-              </w:rPr>
-              <w:t>22</w:t>
+              <w:t>FOTO 22</w:t>
             </w:r>
           </w:p>
         </w:tc>
@@ -4268,7 +4334,7 @@
                           <pic:cNvPicPr/>
                         </pic:nvPicPr>
                         <pic:blipFill>
-                          <a:blip r:embed="rId23" cstate="print">
+                          <a:blip r:embed="rId25" cstate="print">
                             <a:extLst>
                               <a:ext uri="{28A0092B-C50C-407E-A947-70E740481C1C}">
                                 <a14:useLocalDpi xmlns:a14="http://schemas.microsoft.com/office/drawing/2010/main" val="0"/>
@@ -4342,16 +4408,7 @@
                 <w:sz w:val="16"/>
                 <w:szCs w:val="16"/>
               </w:rPr>
-              <w:t xml:space="preserve">Execução do Emassamento e da Pintura do Muro </w:t>
-            </w:r>
-            <w:r>
-              <w:rPr>
-                <w:rFonts w:ascii="Times New Roman" w:hAnsi="Times New Roman" w:cs="Times New Roman"/>
-                <w:color w:val="000000" w:themeColor="text1"/>
-                <w:sz w:val="16"/>
-                <w:szCs w:val="16"/>
-              </w:rPr>
-              <w:t>de Fundo</w:t>
+              <w:t>Execução do Emassamento e da Pintura do Muro de Fundo</w:t>
             </w:r>
           </w:p>
         </w:tc>
@@ -4521,23 +4578,6 @@
         </w:rPr>
       </w:pPr>
     </w:p>
-    <w:p>
-      <w:pPr>
-        <w:shd w:val="clear" w:color="auto" w:fill="FFFFFF" w:themeFill="background1"/>
-        <w:tabs>
-          <w:tab w:val="left" w:pos="2450"/>
-          <w:tab w:val="center" w:pos="4252"/>
-        </w:tabs>
-        <w:spacing w:line="360" w:lineRule="auto"/>
-        <w:ind w:right="480"/>
-        <w:rPr>
-          <w:rFonts w:ascii="Times New Roman" w:hAnsi="Times New Roman" w:cs="Times New Roman"/>
-          <w:color w:val="000000" w:themeColor="text1"/>
-          <w:sz w:val="24"/>
-          <w:szCs w:val="24"/>
-        </w:rPr>
-      </w:pPr>
-    </w:p>
     <w:tbl>
       <w:tblPr>
         <w:tblStyle w:val="Tabelacomgrade"/>
@@ -4786,8 +4826,8 @@
       </w:pPr>
     </w:p>
     <w:sectPr>
-      <w:headerReference w:type="default" r:id="rId24"/>
-      <w:footerReference w:type="default" r:id="rId25"/>
+      <w:headerReference w:type="default" r:id="rId26"/>
+      <w:footerReference w:type="default" r:id="rId27"/>
       <w:pgSz w:w="11906" w:h="16838" w:code="9"/>
       <w:pgMar w:top="1701" w:right="1134" w:bottom="1134" w:left="1701" w:header="284" w:footer="284" w:gutter="0"/>
       <w:cols w:space="708"/>

</xml_diff>